<commit_message>
Schedule daily LLM editorial reviews
</commit_message>
<xml_diff>
--- a/18_DOCX/AGENT_ALIGNMENT_BRIEF.docx
+++ b/18_DOCX/AGENT_ALIGNMENT_BRIEF.docx
@@ -457,6 +457,138 @@
         <w:pStyle w:val="Heading2"/>
       </w:pPr>
       <w:r>
+        <w:t>Uso diário da equipe de LLMs</w:t>
+      </w:r>
+    </w:p>
+    <w:p>
+      <w:r>
+        <w:t>O projeto deve usar subagentes e LLMs externas todos os dias em que houver produção editorial relevante, com o objetivo de ganhar tempo sem perder qualidade.</w:t>
+      </w:r>
+    </w:p>
+    <w:p>
+      <w:r>
+        <w:t>Uso recomendado diário:</w:t>
+      </w:r>
+    </w:p>
+    <w:p>
+      <w:pPr>
+        <w:pStyle w:val="ListBullet"/>
+      </w:pPr>
+      <w:r>
+        <w:t>gerar rascunhos controlados para novos lotes</w:t>
+      </w:r>
+    </w:p>
+    <w:p>
+      <w:pPr>
+        <w:pStyle w:val="ListBullet"/>
+      </w:pPr>
+      <w:r>
+        <w:t>revisar português brasileiro de atendimento</w:t>
+      </w:r>
+    </w:p>
+    <w:p>
+      <w:pPr>
+        <w:pStyle w:val="ListBullet"/>
+      </w:pPr>
+      <w:r>
+        <w:t>revisar japonês técnico e consultas naturais para NotebookLM</w:t>
+      </w:r>
+    </w:p>
+    <w:p>
+      <w:pPr>
+        <w:pStyle w:val="ListBullet"/>
+      </w:pPr>
+      <w:r>
+        <w:t>procurar riscos de promessa indevida</w:t>
+      </w:r>
+    </w:p>
+    <w:p>
+      <w:pPr>
+        <w:pStyle w:val="ListBullet"/>
+      </w:pPr>
+      <w:r>
+        <w:t>sugerir objeções reais do cliente brasileiro</w:t>
+      </w:r>
+    </w:p>
+    <w:p>
+      <w:pPr>
+        <w:pStyle w:val="ListBullet"/>
+      </w:pPr>
+      <w:r>
+        <w:t>sugerir próximos passos operacionais</w:t>
+      </w:r>
+    </w:p>
+    <w:p>
+      <w:pPr>
+        <w:pStyle w:val="ListBullet"/>
+      </w:pPr>
+      <w:r>
+        <w:t>auditar referências cruzadas e lacunas de formato</w:t>
+      </w:r>
+    </w:p>
+    <w:p>
+      <w:r>
+        <w:t>Limites obrigatórios:</w:t>
+      </w:r>
+    </w:p>
+    <w:p>
+      <w:pPr>
+        <w:pStyle w:val="ListBullet"/>
+      </w:pPr>
+      <w:r>
+        <w:t>LLM externa não decide padrão editorial</w:t>
+      </w:r>
+    </w:p>
+    <w:p>
+      <w:pPr>
+        <w:pStyle w:val="ListBullet"/>
+      </w:pPr>
+      <w:r>
+        <w:t>LLM externa não altera tradução aprovada sem justificativa</w:t>
+      </w:r>
+    </w:p>
+    <w:p>
+      <w:pPr>
+        <w:pStyle w:val="ListBullet"/>
+      </w:pPr>
+      <w:r>
+        <w:t>LLM externa não substitui validação do projeto</w:t>
+      </w:r>
+    </w:p>
+    <w:p>
+      <w:pPr>
+        <w:pStyle w:val="ListBullet"/>
+      </w:pPr>
+      <w:r>
+        <w:t>LLM externa não publica diretamente no GitHub</w:t>
+      </w:r>
+    </w:p>
+    <w:p>
+      <w:pPr>
+        <w:pStyle w:val="ListBullet"/>
+      </w:pPr>
+      <w:r>
+        <w:t>LLM externa não pode introduzir romaji</w:t>
+      </w:r>
+    </w:p>
+    <w:p>
+      <w:pPr>
+        <w:pStyle w:val="ListBullet"/>
+      </w:pPr>
+      <w:r>
+        <w:t>LLM externa não pode prometer cobertura, pagamento, prazo, aceitação ou decisão da seguradora</w:t>
+      </w:r>
+    </w:p>
+    <w:p>
+      <w:r>
+        <w:t>O agente principal deve consolidar tudo como editor-chefe antes de qualquer entrega.</w:t>
+      </w:r>
+    </w:p>
+    <w:p>
+      <w:pPr>
+        <w:pStyle w:val="Heading2"/>
+      </w:pPr>
+      <w:r>
         <w:t>Padrão obrigatório de fala ao cliente</w:t>
       </w:r>
     </w:p>

</xml_diff>

<commit_message>
Add GitHub secret safety rules
</commit_message>
<xml_diff>
--- a/18_DOCX/AGENT_ALIGNMENT_BRIEF.docx
+++ b/18_DOCX/AGENT_ALIGNMENT_BRIEF.docx
@@ -313,6 +313,146 @@
       </w:pPr>
       <w:r>
         <w:t>sincronizar com GitHub após validação</w:t>
+      </w:r>
+    </w:p>
+    <w:p>
+      <w:pPr>
+        <w:pStyle w:val="Heading2"/>
+      </w:pPr>
+      <w:r>
+        <w:t>Segurança e sigilo</w:t>
+      </w:r>
+    </w:p>
+    <w:p>
+      <w:r>
+        <w:t>O projeto deve tratar arquivos e informações sensíveis com atenção máxima.</w:t>
+      </w:r>
+    </w:p>
+    <w:p>
+      <w:r>
+        <w:t>Nunca publicar, compartilhar, copiar para ferramentas externas ou enviar ao GitHub:</w:t>
+      </w:r>
+    </w:p>
+    <w:p>
+      <w:pPr>
+        <w:pStyle w:val="ListBullet"/>
+      </w:pPr>
+      <w:r>
+        <w:t>senhas</w:t>
+      </w:r>
+    </w:p>
+    <w:p>
+      <w:pPr>
+        <w:pStyle w:val="ListBullet"/>
+      </w:pPr>
+      <w:r>
+        <w:t>tokens</w:t>
+      </w:r>
+    </w:p>
+    <w:p>
+      <w:pPr>
+        <w:pStyle w:val="ListBullet"/>
+      </w:pPr>
+      <w:r>
+        <w:t>chaves de API</w:t>
+      </w:r>
+    </w:p>
+    <w:p>
+      <w:pPr>
+        <w:pStyle w:val="ListBullet"/>
+      </w:pPr>
+      <w:r>
+        <w:t>credenciais de GitHub</w:t>
+      </w:r>
+    </w:p>
+    <w:p>
+      <w:pPr>
+        <w:pStyle w:val="ListBullet"/>
+      </w:pPr>
+      <w:r>
+        <w:t>variáveis de ambiente com segredos</w:t>
+      </w:r>
+    </w:p>
+    <w:p>
+      <w:pPr>
+        <w:pStyle w:val="ListBullet"/>
+      </w:pPr>
+      <w:r>
+        <w:t>arquivos `.env`</w:t>
+      </w:r>
+    </w:p>
+    <w:p>
+      <w:pPr>
+        <w:pStyle w:val="ListBullet"/>
+      </w:pPr>
+      <w:r>
+        <w:t>chaves privadas</w:t>
+      </w:r>
+    </w:p>
+    <w:p>
+      <w:pPr>
+        <w:pStyle w:val="ListBullet"/>
+      </w:pPr>
+      <w:r>
+        <w:t>certificados</w:t>
+      </w:r>
+    </w:p>
+    <w:p>
+      <w:pPr>
+        <w:pStyle w:val="ListBullet"/>
+      </w:pPr>
+      <w:r>
+        <w:t>dados pessoais ou documentos privados</w:t>
+      </w:r>
+    </w:p>
+    <w:p>
+      <w:pPr>
+        <w:pStyle w:val="ListBullet"/>
+      </w:pPr>
+      <w:r>
+        <w:t>conteúdo confidencial de clientes, seguradoras ou parceiros</w:t>
+      </w:r>
+    </w:p>
+    <w:p>
+      <w:r>
+        <w:t>Se algum arquivo ou trecho parecer sensível, o agente deve parar e consultar o usuário antes de qualquer ação, explicando:</w:t>
+      </w:r>
+    </w:p>
+    <w:p>
+      <w:pPr>
+        <w:pStyle w:val="ListBullet"/>
+      </w:pPr>
+      <w:r>
+        <w:t>qual arquivo ou informação parece sensível</w:t>
+      </w:r>
+    </w:p>
+    <w:p>
+      <w:pPr>
+        <w:pStyle w:val="ListBullet"/>
+      </w:pPr>
+      <w:r>
+        <w:t>por que há risco</w:t>
+      </w:r>
+    </w:p>
+    <w:p>
+      <w:pPr>
+        <w:pStyle w:val="ListBullet"/>
+      </w:pPr>
+      <w:r>
+        <w:t>quais opções seguras existem</w:t>
+      </w:r>
+    </w:p>
+    <w:p>
+      <w:pPr>
+        <w:pStyle w:val="ListBullet"/>
+      </w:pPr>
+      <w:r>
+        <w:t>qual ação recomenda</w:t>
+      </w:r>
+    </w:p>
+    <w:p>
+      <w:r>
+        <w:t>No GitHub, dar atenção especial a variáveis de ambiente, senhas, tokens, arquivos `.env`, chaves privadas e dumps de credenciais. Esses itens não devem entrar em commit, pacote, relatório, prompt de LLM externa ou documentação pública.</w:t>
       </w:r>
     </w:p>
     <w:p>

</xml_diff>